<commit_message>
Updated documentation to catch up with the state of the project.
</commit_message>
<xml_diff>
--- a/papers/_sources/rope_mass_paper.docx
+++ b/papers/_sources/rope_mass_paper.docx
@@ -912,7 +912,7 @@
         <w:t xml:space="preserve">D_E</w:t>
       </w:r>
       <w:r>
-        <w:t xml:space="preserve"> is computed blind from the electron's equilibrium profile (Commission W); the factor 4 is the rectified two-component sampling of the force-type charge coupling (Gate 2, with Gate 1's rectification theorem); the three factors of π come from the J0 anchor conversion (Gate 1, κ = π/4 forced), the target-scale conversion (Commission E), and the two-constraint closure geometry (Commissions U and T, ln x* = π²). The +178.8 ppm residual is the single unexplained number. This is a reduction of 1/α to one blind number times a derived prefactor — not a derivation of α's value.</w:t>
+        <w:t xml:space="preserve"> is computed blind from the electron's equilibrium profile (Commission W); the factor 4 is the rectified two-component sampling of the force-type charge coupling (Gate 2, with Gate 1's rectification theorem); the three factors of π come from the J0 anchor conversion (Gate 1, κ = π/4 forced), the target-scale conversion (Commission E), and the two-constraint closure geometry (Commissions U and T, ln x* = π²). The +178.8 ppm (0.018%) residual is the single unexplained number. This is a reduction of 1/α to one blind number times a derived prefactor — not a derivation of α's value.</w:t>
       </w:r>
     </w:p>
     <w:p>
@@ -2228,6 +2228,98 @@
         </w:tc>
       </w:tr>
     </w:tbl>
+    <w:p>
+      <w:pPr>
+        <w:pStyle w:val="Heading2"/>
+        <w:spacing w:after="100" w:before="200"/>
+      </w:pPr>
+      <w:r>
+        <w:rPr>
+          <w:b/>
+          <w:bCs/>
+          <w:color w:val="2E5A88"/>
+        </w:rPr>
+        <w:t xml:space="preserve">3.1a The mass hierarchy as internal weighting</w:t>
+      </w:r>
+    </w:p>
+    <w:p>
+      <w:pPr>
+        <w:spacing w:after="120" w:line="276"/>
+        <w:jc w:val="both"/>
+      </w:pPr>
+      <w:r>
+        <w:t xml:space="preserve">Before the layers above the electron, it is worth stating how the framework frames the </w:t>
+      </w:r>
+      <w:r>
+        <w:rPr>
+          <w:i/>
+          <w:iCs/>
+        </w:rPr>
+        <w:t xml:space="preserve">hierarchy</w:t>
+      </w:r>
+      <w:r>
+        <w:t xml:space="preserve"> of fundamental-particle masses itself — the enormous span from the electron to the top quark. In the Standard Model this hierarchy is a set of independent Yukawa couplings, one free number per particle, with no account of why they take the values they do. The rope framework reframes it: mass is an </w:t>
+      </w:r>
+      <w:r>
+        <w:rPr>
+          <w:i/>
+          <w:iCs/>
+        </w:rPr>
+        <w:t xml:space="preserve">internal, topological weighting</w:t>
+      </w:r>
+      <w:r>
+        <w:t xml:space="preserve"> of the knot configuration — how strongly a given knot is internally suppressed — rather than a list of independent coupling constants. This turns the hierarchy problem into a question about knot structure, which is at least the right kind of question for a theory that builds particles from filament topology.</w:t>
+      </w:r>
+    </w:p>
+    <w:p>
+      <w:pPr>
+        <w:spacing w:after="120" w:line="276"/>
+        <w:jc w:val="both"/>
+      </w:pPr>
+      <w:r>
+        <w:t xml:space="preserve">What this framing does and does not deliver, stated honestly. For the </w:t>
+      </w:r>
+      <w:r>
+        <w:rPr>
+          <w:i/>
+          <w:iCs/>
+        </w:rPr>
+        <w:t xml:space="preserve">charged leptons</w:t>
+      </w:r>
+      <w:r>
+        <w:t xml:space="preserve">, the internal weighting is captured by the Koide-phase relation (reported in the separate Lepton Masses paper), conditionally — the relation succeeds against the measured Weinberg angle but fails against the model’s own θ_W, and that conditional-success-with-failure is pinned in the test suite rather than smoothed over. For </w:t>
+      </w:r>
+      <w:r>
+        <w:rPr>
+          <w:i/>
+          <w:iCs/>
+        </w:rPr>
+        <w:t xml:space="preserve">quarks and bosons</w:t>
+      </w:r>
+      <w:r>
+        <w:t xml:space="preserve">, the internal-weighting picture is stated but the specific mass weights are </w:t>
+      </w:r>
+      <w:r>
+        <w:rPr>
+          <w:i/>
+          <w:iCs/>
+        </w:rPr>
+        <w:t xml:space="preserve">not</w:t>
+      </w:r>
+      <w:r>
+        <w:t xml:space="preserve"> derived — they remain open. So the honest status is: mass-as-internal-weighting is a framing (Modeled); the charged-lepton weights are conditional (Conjecture, see Lepton Masses); and a complete first-principles mass spectrum for all Standard-Model particles is </w:t>
+      </w:r>
+      <w:r>
+        <w:rPr>
+          <w:i/>
+          <w:iCs/>
+        </w:rPr>
+        <w:t xml:space="preserve">not</w:t>
+      </w:r>
+      <w:r>
+        <w:t xml:space="preserve"> claimed. The framing reorganizes the hierarchy problem; it does not yet solve it.</w:t>
+      </w:r>
+    </w:p>
     <w:p>
       <w:pPr>
         <w:pStyle w:val="Heading2"/>

</xml_diff>